<commit_message>
docs: experiment frontend — remove Aston Martin, focus on 7 pages added
- Theory now lists 7 pages with brief purpose each (Home, Browse Vehicles, Vehicle Detail+Wizard, Login/Register, Customer Dashboard, Admin Dashboard, Review) — no design system mention
- Photos captions updated to describe pages, hover, filters, green stats etc. without Aston Martin
</commit_message>
<xml_diff>
--- a/EXPERIMENT_FRONTEND.docx
+++ b/EXPERIMENT_FRONTEND.docx
@@ -19,7 +19,7 @@
     <w:p>
       <w:pPr>
         <w:pStyle w:val="Heading2"/>
-        <w:jc w:val="left"/>
+        <w:jc w:val="center"/>
       </w:pPr>
       <w:r>
         <w:rPr>
@@ -36,7 +36,6 @@
       </w:pPr>
       <w:r>
         <w:rPr>
-          <w:b w:val="0"/>
           <w:i w:val="0"/>
           <w:color w:val="606060"/>
           <w:sz w:val="18"/>
@@ -47,7 +46,6 @@
     <w:p>
       <w:pPr>
         <w:pStyle w:val="Heading2"/>
-        <w:jc w:val="left"/>
       </w:pPr>
       <w:r>
         <w:rPr>
@@ -64,7 +62,6 @@
       </w:pPr>
       <w:r>
         <w:rPr>
-          <w:b w:val="0"/>
           <w:i w:val="0"/>
           <w:color w:val="181818"/>
           <w:sz w:val="20"/>
@@ -75,7 +72,6 @@
     <w:p>
       <w:pPr>
         <w:pStyle w:val="Heading2"/>
-        <w:jc w:val="left"/>
       </w:pPr>
       <w:r>
         <w:rPr>
@@ -101,7 +97,6 @@
         <w:tc>
           <w:tcPr>
             <w:tcW w:type="dxa" w:w="5112"/>
-            <w:vAlign w:val="center"/>
             <w:shd w:fill="1B6157"/>
           </w:tcPr>
           <w:p>
@@ -117,7 +112,6 @@
         <w:tc>
           <w:tcPr>
             <w:tcW w:type="dxa" w:w="5112"/>
-            <w:vAlign w:val="center"/>
             <w:shd w:fill="1B6157"/>
           </w:tcPr>
           <w:p>
@@ -154,7 +148,7 @@
               <w:rPr>
                 <w:sz w:val="18"/>
               </w:rPr>
-              <w:t>Code editor for HTML/CSS/JS</w:t>
+              <w:t>Code editor for HTML, CSS, JavaScript</w:t>
             </w:r>
           </w:p>
         </w:tc>
@@ -182,7 +176,7 @@
               <w:rPr>
                 <w:sz w:val="18"/>
               </w:rPr>
-              <w:t>Testing and screenshots (headless)</w:t>
+              <w:t>Testing and screenshots</w:t>
             </w:r>
           </w:p>
         </w:tc>
@@ -197,7 +191,7 @@
               <w:rPr>
                 <w:sz w:val="18"/>
               </w:rPr>
-              <w:t>Node.js 22 + Express</w:t>
+              <w:t>Node.js + Express</w:t>
             </w:r>
           </w:p>
         </w:tc>
@@ -210,7 +204,7 @@
               <w:rPr>
                 <w:sz w:val="18"/>
               </w:rPr>
-              <w:t>Serves frontend on http://localhost:3000 and backend API on http://localhost:5000</w:t>
+              <w:t>Runs the website on http://localhost:5000 (backend) and http://localhost:3000 (frontend)</w:t>
             </w:r>
           </w:p>
         </w:tc>
@@ -238,7 +232,7 @@
               <w:rPr>
                 <w:sz w:val="18"/>
               </w:rPr>
-              <w:t>Structure, Aston Martin design, interactivity (Fetch API)</w:t>
+              <w:t>Structure, design and interactivity</w:t>
             </w:r>
           </w:p>
         </w:tc>
@@ -253,7 +247,7 @@
               <w:rPr>
                 <w:sz w:val="18"/>
               </w:rPr>
-              <w:t>Font Awesome 6, Chart.js</w:t>
+              <w:t>Font Awesome, Chart.js</w:t>
             </w:r>
           </w:p>
         </w:tc>
@@ -275,7 +269,6 @@
     <w:p>
       <w:pPr>
         <w:pStyle w:val="Heading2"/>
-        <w:jc w:val="left"/>
       </w:pPr>
       <w:r>
         <w:rPr>
@@ -292,12 +285,11 @@
       </w:pPr>
       <w:r>
         <w:rPr>
-          <w:b w:val="0"/>
           <w:i w:val="0"/>
           <w:color w:val="181818"/>
           <w:sz w:val="18"/>
         </w:rPr>
-        <w:t>Frontend is the part of a website that a user sees and interacts with. It is built with three basic technologies: HTML for structure, CSS for design, and JavaScript for behaviour. When a user clicks or types, JavaScript sends a request to the backend (server) and displays the reply without reloading the page.</w:t>
+        <w:t>Frontend is the part of a website that users see and interact with in the browser. It is built using HTML for structure, CSS for design, and JavaScript for behaviour. When a user clicks a button or selects a filter, JavaScript sends a request to the server and updates the page without reloading.</w:t>
       </w:r>
     </w:p>
     <w:p>
@@ -306,12 +298,151 @@
       </w:pPr>
       <w:r>
         <w:rPr>
-          <w:b w:val="0"/>
           <w:i w:val="0"/>
           <w:color w:val="181818"/>
           <w:sz w:val="18"/>
         </w:rPr>
-        <w:t>For this mini project we used the Aston Martin design system: a luxury racing-green colour (#1B6157), big car photos as background, light elegant headings (Cormorant Garamond weight 300), and simple pill buttons. The layout is clean — one big heading, a short line, and one or two buttons per screen — so the car photo remains the hero.</w:t>
+        <w:t>For this mini project we created 7 main pages:</w:t>
+      </w:r>
+    </w:p>
+    <w:p>
+      <w:pPr>
+        <w:pStyle w:val="ListBullet"/>
+      </w:pPr>
+      <w:r>
+        <w:rPr>
+          <w:b/>
+          <w:color w:val="1B6157"/>
+          <w:sz w:val="18"/>
+        </w:rPr>
+        <w:t xml:space="preserve">1. Home Page (index.html) — </w:t>
+      </w:r>
+      <w:r>
+        <w:rPr>
+          <w:color w:val="333333"/>
+          <w:sz w:val="18"/>
+        </w:rPr>
+        <w:t>Shows a large banner, brand logos, 6 featured cars, 10 showrooms in Navi Mumbai, 3 steps to book, and a green contact footer. It is the first page users see.</w:t>
+      </w:r>
+    </w:p>
+    <w:p>
+      <w:pPr>
+        <w:pStyle w:val="ListBullet"/>
+      </w:pPr>
+      <w:r>
+        <w:rPr>
+          <w:b/>
+          <w:color w:val="1B6157"/>
+          <w:sz w:val="18"/>
+        </w:rPr>
+        <w:t xml:space="preserve">2. Browse Vehicles (vehicles.html) — </w:t>
+      </w:r>
+      <w:r>
+        <w:rPr>
+          <w:color w:val="333333"/>
+          <w:sz w:val="18"/>
+        </w:rPr>
+        <w:t>Shows all 28 cars. Users can filter by Brand, Fuel type, Max Price, and Status using dropdowns only (no typing). Results are paginated 9 per page. Each car card shows photo, brand logo, fuel, price in rupees and a Book button.</w:t>
+      </w:r>
+    </w:p>
+    <w:p>
+      <w:pPr>
+        <w:pStyle w:val="ListBullet"/>
+      </w:pPr>
+      <w:r>
+        <w:rPr>
+          <w:b/>
+          <w:color w:val="1B6157"/>
+          <w:sz w:val="18"/>
+        </w:rPr>
+        <w:t xml:space="preserve">3. Vehicle Detail &amp; Booking (vehicle.html) — </w:t>
+      </w:r>
+      <w:r>
+        <w:rPr>
+          <w:color w:val="333333"/>
+          <w:sz w:val="18"/>
+        </w:rPr>
+        <w:t>On clicking a car, users see full details — engine, mileage, colours, price — and the automatically assigned showroom. A 3-step wizard lets them pick a date, choose one of 9 time slots (9am-6pm), and confirm. Login is required before booking.</w:t>
+      </w:r>
+    </w:p>
+    <w:p>
+      <w:pPr>
+        <w:pStyle w:val="ListBullet"/>
+      </w:pPr>
+      <w:r>
+        <w:rPr>
+          <w:b/>
+          <w:color w:val="1B6157"/>
+          <w:sz w:val="18"/>
+        </w:rPr>
+        <w:t xml:space="preserve">4. Login &amp; Register (login.html, register.html) — </w:t>
+      </w:r>
+      <w:r>
+        <w:rPr>
+          <w:color w:val="333333"/>
+          <w:sz w:val="18"/>
+        </w:rPr>
+        <w:t>New users can register with name, email and password. Existing users login. Login has User and Admin options; Admin needs a secret code. After login, the user stays logged in.</w:t>
+      </w:r>
+    </w:p>
+    <w:p>
+      <w:pPr>
+        <w:pStyle w:val="ListBullet"/>
+      </w:pPr>
+      <w:r>
+        <w:rPr>
+          <w:b/>
+          <w:color w:val="1B6157"/>
+          <w:sz w:val="18"/>
+        </w:rPr>
+        <w:t xml:space="preserve">5. Customer Dashboard (dashboard.html) — </w:t>
+      </w:r>
+      <w:r>
+        <w:rPr>
+          <w:color w:val="333333"/>
+          <w:sz w:val="18"/>
+        </w:rPr>
+        <w:t>Logged-in customers see their bookings in a table with status (Pending, Approved, Completed, Cancelled) and any message from admin. They can cancel pending bookings and see their profile. Completed bookings show a Review button.</w:t>
+      </w:r>
+    </w:p>
+    <w:p>
+      <w:pPr>
+        <w:pStyle w:val="ListBullet"/>
+      </w:pPr>
+      <w:r>
+        <w:rPr>
+          <w:b/>
+          <w:color w:val="1B6157"/>
+          <w:sz w:val="18"/>
+        </w:rPr>
+        <w:t xml:space="preserve">6. Admin Dashboard (admin.html) — </w:t>
+      </w:r>
+      <w:r>
+        <w:rPr>
+          <w:color w:val="333333"/>
+          <w:sz w:val="18"/>
+        </w:rPr>
+        <w:t>Admin sees total counts, charts for bookings by status and cars by brand, and tabs for Bookings, Reviews, Vehicles, Showrooms and Users. In Bookings, admin can Approve or Reject a request through a popup window where they type a message for the customer.</w:t>
+      </w:r>
+    </w:p>
+    <w:p>
+      <w:pPr>
+        <w:pStyle w:val="ListBullet"/>
+      </w:pPr>
+      <w:r>
+        <w:rPr>
+          <w:b/>
+          <w:color w:val="1B6157"/>
+          <w:sz w:val="18"/>
+        </w:rPr>
+        <w:t xml:space="preserve">7. Review Page (review.html) — </w:t>
+      </w:r>
+      <w:r>
+        <w:rPr>
+          <w:color w:val="333333"/>
+          <w:sz w:val="18"/>
+        </w:rPr>
+        <w:t>After a test drive is marked Completed, customers can give a 5-star rating and write suggestions in a text box. Reviews are saved and later visible to admin in the Reviews tab.</w:t>
       </w:r>
     </w:p>
     <w:p>
@@ -320,18 +451,16 @@
       </w:pPr>
       <w:r>
         <w:rPr>
-          <w:b w:val="0"/>
           <w:i w:val="0"/>
           <w:color w:val="181818"/>
           <w:sz w:val="18"/>
         </w:rPr>
-        <w:t>Key frontend concepts used: (1) Responsive design — same page works on mobile (375px) and desktop (1920px) via Flexbox/Grid and media queries. (2) Fetch API — JavaScript calls backend JSON APIs (e.g., GET /api/vehicles) and updates the page dynamically. (3) LocalStorage — remembers login (JWT token) so the user stays logged in. (4) Preloader — ATDP logo with wings animates for 1 second on the home page first visit, then fades.</w:t>
+        <w:t>All pages are responsive — they work on both mobile and desktop. Navigation is through the top header (Home, Vehicles) and the hamburger menu on mobile.</w:t>
       </w:r>
     </w:p>
     <w:p>
       <w:pPr>
         <w:pStyle w:val="Heading2"/>
-        <w:jc w:val="left"/>
       </w:pPr>
       <w:r>
         <w:rPr>
@@ -348,17 +477,16 @@
       </w:pPr>
       <w:r>
         <w:rPr>
-          <w:b w:val="0"/>
           <w:i/>
           <w:color w:val="606060"/>
           <w:sz w:val="18"/>
         </w:rPr>
-        <w:t>All screenshots taken at 1920×1080 via Chrome headless on http://localhost:5000 (frontend also on http://localhost:3000). Prices in Indian Rupees, on-road Navi Mumbai.</w:t>
+        <w:t>All screenshots taken at 1920x1080 via Chrome headless on http://localhost:5000 (also on http://localhost:3000). Prices are on-road Navi Mumbai in Indian Rupees.</w:t>
       </w:r>
     </w:p>
     <w:p>
       <w:pPr>
-        <w:spacing w:before="240" w:after="80"/>
+        <w:spacing w:before="240"/>
         <w:jc w:val="center"/>
       </w:pPr>
       <w:r>
@@ -380,7 +508,7 @@
           <w:color w:val="606060"/>
           <w:sz w:val="16"/>
         </w:rPr>
-        <w:t>Hero with ATDP preloader (logo photo), brand strip with local SVG logos, featured 6 vehicles, promo band, 10 showrooms, 3 steps (hover to green), green contact footer.</w:t>
+        <w:t>Banner, brand strip with local logos, featured cars, showrooms, 3 steps (hover turns green), green contact footer.</w:t>
       </w:r>
     </w:p>
     <w:p>
@@ -437,7 +565,7 @@
     </w:p>
     <w:p>
       <w:pPr>
-        <w:spacing w:before="240" w:after="80"/>
+        <w:spacing w:before="240"/>
         <w:jc w:val="center"/>
       </w:pPr>
       <w:r>
@@ -459,7 +587,7 @@
           <w:color w:val="606060"/>
           <w:sz w:val="16"/>
         </w:rPr>
-        <w:t>Filters: Brand / Fuel / Max Price / Status dropdowns only (no search bar). Shows 28 cars, pagination 9/page, card with brand logo badge.</w:t>
+        <w:t>Dropdown filters Brand/Fuel/Max Price/Status only, no search bar, pagination 9 per page.</w:t>
       </w:r>
     </w:p>
     <w:p>
@@ -516,7 +644,7 @@
     </w:p>
     <w:p>
       <w:pPr>
-        <w:spacing w:before="240" w:after="80"/>
+        <w:spacing w:before="240"/>
         <w:jc w:val="center"/>
       </w:pPr>
       <w:r>
@@ -525,7 +653,7 @@
           <w:color w:val="1B6157"/>
           <w:sz w:val="20"/>
         </w:rPr>
-        <w:t>3. Vehicle Detail &amp; Booking Wizard (vehicle.html?id=1)</w:t>
+        <w:t>3. Vehicle Detail &amp; Booking Wizard</w:t>
       </w:r>
     </w:p>
     <w:p>
@@ -538,7 +666,7 @@
           <w:color w:val="606060"/>
           <w:sz w:val="16"/>
         </w:rPr>
-        <w:t>Car specs, colours, on-road price, auto-assigned showroom, 3-step wizard (Date → Time Slot 09-18 → Confirm), login gate if not logged in.</w:t>
+        <w:t>Full specs, colours, price, auto-assigned showroom, 3-step Date → Slot → Confirm with login gate.</w:t>
       </w:r>
     </w:p>
     <w:p>
@@ -590,12 +718,12 @@
           <w:color w:val="606060"/>
           <w:sz w:val="16"/>
         </w:rPr>
-        <w:t>Fig: 3. Vehicle Detail &amp; Booking Wizard (vehicle.html?id=1)</w:t>
+        <w:t>Fig: 3. Vehicle Detail &amp; Booking Wizard</w:t>
       </w:r>
     </w:p>
     <w:p>
       <w:pPr>
-        <w:spacing w:before="240" w:after="80"/>
+        <w:spacing w:before="240"/>
         <w:jc w:val="center"/>
       </w:pPr>
       <w:r>
@@ -617,7 +745,7 @@
           <w:color w:val="606060"/>
           <w:sz w:val="16"/>
         </w:rPr>
-        <w:t>User/Admin tabs, Admin needs secret code (hidden hint), demo logins visible, JWT stored in localStorage.</w:t>
+        <w:t>User/Admin tabs, demo logins, stays logged in after success.</w:t>
       </w:r>
     </w:p>
     <w:p>
@@ -674,7 +802,7 @@
     </w:p>
     <w:p>
       <w:pPr>
-        <w:spacing w:before="240" w:after="80"/>
+        <w:spacing w:before="240"/>
         <w:jc w:val="center"/>
       </w:pPr>
       <w:r>
@@ -696,7 +824,7 @@
           <w:color w:val="606060"/>
           <w:sz w:val="16"/>
         </w:rPr>
-        <w:t>Name, email, password (8 chars + upper/lower/digit), phone, address → creates customer account.</w:t>
+        <w:t>Fields for name, email, password, phone, address.</w:t>
       </w:r>
     </w:p>
     <w:p>
@@ -753,7 +881,7 @@
     </w:p>
     <w:p>
       <w:pPr>
-        <w:spacing w:before="240" w:after="80"/>
+        <w:spacing w:before="240"/>
         <w:jc w:val="center"/>
       </w:pPr>
       <w:r>
@@ -775,7 +903,7 @@
           <w:color w:val="606060"/>
           <w:sz w:val="16"/>
         </w:rPr>
-        <w:t>Green stats (Total/Pending/Approved/Completed) #1B6157 bold, bookings table with Status &amp; Admin Response, Profile + Change Password, Review button for Completed.</w:t>
+        <w:t>Green stats boxes, bookings table with Status &amp; Admin Response, Review button for Completed.</w:t>
       </w:r>
     </w:p>
     <w:p>
@@ -832,7 +960,7 @@
     </w:p>
     <w:p>
       <w:pPr>
-        <w:spacing w:before="240" w:after="80"/>
+        <w:spacing w:before="240"/>
         <w:jc w:val="center"/>
       </w:pPr>
       <w:r>
@@ -854,7 +982,7 @@
           <w:color w:val="606060"/>
           <w:sz w:val="16"/>
         </w:rPr>
-        <w:t>Green stats, doughnut + bar charts, tabs Bookings/Vehicles/Showrooms/Users/Reviews, Approve/Reject via themed modal window with textarea, vehicle price fix (was ₹NaN).</w:t>
+        <w:t>Stats, charts, tabs Bookings/Reviews/Vehicles/Showrooms/Users, Approve/Reject modal with textarea.</w:t>
       </w:r>
     </w:p>
     <w:p>
@@ -911,7 +1039,7 @@
     </w:p>
     <w:p>
       <w:pPr>
-        <w:spacing w:before="240" w:after="80"/>
+        <w:spacing w:before="240"/>
         <w:jc w:val="center"/>
       </w:pPr>
       <w:r>
@@ -933,7 +1061,7 @@
           <w:color w:val="606060"/>
           <w:sz w:val="16"/>
         </w:rPr>
-        <w:t>After completion: 5-star selection (★), Any Suggestions textarea, ATDP logo while loading, selector for completed bookings if direct access.</w:t>
+        <w:t>5-star selection, Any Suggestions text box, logo while loading, completed-bookings selector.</w:t>
       </w:r>
     </w:p>
     <w:p>
@@ -991,7 +1119,6 @@
     <w:p>
       <w:pPr>
         <w:pStyle w:val="Heading2"/>
-        <w:jc w:val="left"/>
       </w:pPr>
       <w:r>
         <w:rPr>
@@ -1008,12 +1135,11 @@
       </w:pPr>
       <w:r>
         <w:rPr>
-          <w:b w:val="0"/>
           <w:i w:val="0"/>
           <w:color w:val="181818"/>
           <w:sz w:val="18"/>
         </w:rPr>
-        <w:t>Thus, we have successfully designed and developed the frontend for the mini project — a responsive, luxury-themed portal for Navi Mumbai with 7 pages, dropdown-only filters, green hover effects, and complete booking-to-review flow — using only basic HTML, CSS, JavaScript and SQLite backend APIs.</w:t>
+        <w:t>Thus, we have successfully designed and developed the frontend for the mini project — a responsive portal with 7 pages for Navi Mumbai that lets customers browse and book cars and lets admin manage bookings to completion and reviews — using only basic HTML, CSS, JavaScript and SQLite backend APIs.</w:t>
       </w:r>
     </w:p>
     <w:p>

</xml_diff>